<commit_message>
Killercoda como lab primario y sus limites en el material
Co-Authored-By: Claude Opus 5 <noreply@anthropic.com>
</commit_message>
<xml_diff>
--- a/Arquitectura de Sistemas Computacionales/Clases/Clase 3 - Virtualizacion y contenedores/Taller Clase 3 — Contenedor stub CloudLite.docx
+++ b/Arquitectura de Sistemas Computacionales/Clases/Clase 3 - Virtualizacion y contenedores/Taller Clase 3 — Contenedor stub CloudLite.docx
@@ -115,7 +115,7 @@
           <w:color w:val="2B2B2B"/>
           <w:sz w:val="22"/>
         </w:rPr>
-        <w:t>Lab en navegador LabEx Docker Playground: sin Docker Desktop obligatorio.</w:t>
+        <w:t>Lab en navegador Killercoda: sin Docker Desktop obligatorio.</w:t>
       </w:r>
     </w:p>
     <w:p>
@@ -221,7 +221,7 @@
           <w:color w:val="2B2B2B"/>
           <w:sz w:val="22"/>
         </w:rPr>
-        <w:t>Abrir LabEx Docker Playground (labex.io, login con Google/Microsoft); sesión temporal.</w:t>
+        <w:t>Abrir Killercoda (killercoda.com, escenario Ubuntu). Cuenta gratuita, sin tarjeta · la sesión caduca a 1 h · un escenario a la vez.</w:t>
       </w:r>
     </w:p>
     <w:p>
@@ -266,7 +266,7 @@
           <w:color w:val="2B2B2B"/>
           <w:sz w:val="22"/>
         </w:rPr>
-        <w:t>LabEx Docker Playground · alterna si no carga: Killercoda</w:t>
+        <w:t>Killercoda · alterna si no carga: LabEx Docker Playground</w:t>
       </w:r>
     </w:p>
     <w:p>
@@ -357,7 +357,7 @@
           <w:color w:val="2B2B2B"/>
           <w:sz w:val="22"/>
         </w:rPr>
-        <w:t>Paso 4: abra LabEx Docker Playground en labex.io con su cuenta de Google o Microsoft (o Killercoda si no carga), ejecute docker build -t cloudlite-api:v1 . y docker run -d -p 8080:8080 cloudlite-api:v1, compruebe con curl que la ruta de salud devuelve 200 y llene la bitacora de 5 filas comando / que esperaba / que salio / evidencia, verificando que la captura muestre a la vez el prompt del lab, la salida del docker ps y la hora del sistema.</w:t>
+        <w:t>Paso 4: abra Killercoda en killercoda.com con su cuenta gratuita y lance un escenario Ubuntu (si no carga, LabEx Docker Playground como alterna; ojo: LabEx solo da 3 sesiones al dia en el plan gratuito), ejecute docker build -t cloudlite-api:v1 . y docker run -d -p 8080:8080 cloudlite-api:v1, compruebe con curl que la ruta de salud devuelve 200 y llene la bitacora de 5 filas comando / que esperaba / que salio / evidencia, verificando que la captura muestre a la vez el prompt del lab, la salida del docker ps y la hora del sistema.</w:t>
       </w:r>
     </w:p>
     <w:p>
@@ -462,6 +462,21 @@
           <w:color w:val="2B2B2B"/>
           <w:sz w:val="22"/>
         </w:rPr>
+        <w:t>☐ ¿El Dockerfile está en tu carpeta del PI y no solo dentro del lab?</w:t>
+      </w:r>
+    </w:p>
+    <w:p>
+      <w:pPr>
+        <w:pStyle w:val="ListBullet"/>
+        <w:spacing w:after="40"/>
+      </w:pPr>
+      <w:r>
+        <w:rPr>
+          <w:rFonts w:ascii="Calibri" w:hAnsi="Calibri" w:eastAsia="Calibri"/>
+          <w:b w:val="0"/>
+          <w:color w:val="2B2B2B"/>
+          <w:sz w:val="22"/>
+        </w:rPr>
         <w:t>☐ ¿El puerto expuesto coincide con el que documentan?</w:t>
       </w:r>
     </w:p>
@@ -552,7 +567,7 @@
           <w:color w:val="2B2B2B"/>
           <w:sz w:val="22"/>
         </w:rPr>
-        <w:t>El estudiante deja el contexto de build verificado en la consola de ExamLab, el Dockerfile de 7 instrucciones documentado y la evidencia del contenedor corriendo en LabEx Docker Playground con su ruta de salud respondiendo 200.</w:t>
+        <w:t>El estudiante deja el contexto de build verificado en la consola de ExamLab, el Dockerfile de 7 instrucciones documentado y la evidencia del contenedor corriendo en Killercoda con su ruta de salud respondiendo 200.</w:t>
       </w:r>
     </w:p>
     <w:p>
@@ -692,7 +707,7 @@
           <w:color w:val="2B2B2B"/>
           <w:sz w:val="22"/>
         </w:rPr>
-        <w:t xml:space="preserve"> Bitacora del laboratorio en LabEx Docker Playground.</w:t>
+        <w:t xml:space="preserve"> Bitacora del laboratorio en Killercoda.</w:t>
       </w:r>
     </w:p>
     <w:p>

</xml_diff>